<commit_message>
Update plain-English guide for Phases 5 and 6
Progress table now shows seven phases done (adds P5 rules and safety engine,
P6 OpenMRS write-back), the next-up pointer moves to Phase 7, the rebuild
recipe gains the OpenMRS write-back step, and the it-works answer cites the
15/15 and 11/11 results.
</commit_message>
<xml_diff>
--- a/docs/Project-Explained-Simply.docx
+++ b/docs/Project-Explained-Simply.docx
@@ -1211,7 +1211,7 @@
         <w:spacing w:after="120"/>
       </w:pPr>
       <w:r>
-        <w:t xml:space="preserve">The project is built in 14 phases (0–13). No phase moves on until it passes its own test. Five are done:</w:t>
+        <w:t xml:space="preserve">The project is built in 14 phases (0–13). No phase moves on until it passes its own test. Seven are done:</w:t>
       </w:r>
     </w:p>
     <w:p>
@@ -1519,6 +1519,84 @@
           </w:p>
         </w:tc>
       </w:tr>
+      <w:tr>
+        <w:tc>
+          <w:tcPr>
+            <w:tcW w:type="dxa" w:w="2600"/>
+            <w:shd w:fill="F3F0FA" w:color="auto" w:val="clear"/>
+            <w:tcMar>
+              <w:top w:type="dxa" w:w="70"/>
+              <w:left w:type="dxa" w:w="120"/>
+              <w:bottom w:type="dxa" w:w="70"/>
+              <w:right w:type="dxa" w:w="120"/>
+            </w:tcMar>
+          </w:tcPr>
+          <w:p>
+            <w:r>
+              <w:rPr>
+                <w:b/>
+                <w:bCs/>
+              </w:rPr>
+              <w:t xml:space="preserve">P5 · Rules &amp; safety engine</w:t>
+            </w:r>
+          </w:p>
+        </w:tc>
+        <w:tc>
+          <w:tcPr>
+            <w:tcW w:type="dxa" w:w="6760"/>
+            <w:shd w:fill="F3F0FA" w:color="auto" w:val="clear"/>
+            <w:tcMar>
+              <w:top w:type="dxa" w:w="70"/>
+              <w:left w:type="dxa" w:w="120"/>
+              <w:bottom w:type="dxa" w:w="70"/>
+              <w:right w:type="dxa" w:w="120"/>
+            </w:tcMar>
+          </w:tcPr>
+          <w:p>
+            <w:r>
+              <w:t xml:space="preserve">Matched each patient and applied the safety rules. Result: 15/15 decisions match the answer keys, and every risky case is sent to a human — with a reason code for every decision.</w:t>
+            </w:r>
+          </w:p>
+        </w:tc>
+      </w:tr>
+      <w:tr>
+        <w:tc>
+          <w:tcPr>
+            <w:tcW w:type="dxa" w:w="2600"/>
+            <w:tcMar>
+              <w:top w:type="dxa" w:w="70"/>
+              <w:left w:type="dxa" w:w="120"/>
+              <w:bottom w:type="dxa" w:w="70"/>
+              <w:right w:type="dxa" w:w="120"/>
+            </w:tcMar>
+          </w:tcPr>
+          <w:p>
+            <w:r>
+              <w:rPr>
+                <w:b/>
+                <w:bCs/>
+              </w:rPr>
+              <w:t xml:space="preserve">P6 · OpenMRS write-back</w:t>
+            </w:r>
+          </w:p>
+        </w:tc>
+        <w:tc>
+          <w:tcPr>
+            <w:tcW w:type="dxa" w:w="6760"/>
+            <w:tcMar>
+              <w:top w:type="dxa" w:w="70"/>
+              <w:left w:type="dxa" w:w="120"/>
+              <w:bottom w:type="dxa" w:w="70"/>
+              <w:right w:type="dxa" w:w="120"/>
+            </w:tcMar>
+          </w:tcPr>
+          <w:p>
+            <w:r>
+              <w:t xml:space="preserve">Built the real record-writing path: the robot creates a referral in OpenMRS and re-reads it to verify. Idempotent (no duplicates on a rerun), with a working live duplicate check. 11/11 checks pass.</w:t>
+            </w:r>
+          </w:p>
+        </w:tc>
+      </w:tr>
     </w:tbl>
     <w:p>
       <w:pPr>
@@ -1529,10 +1607,10 @@
           <w:b/>
           <w:bCs/>
         </w:rPr>
-        <w:t xml:space="preserve">Next up — Phase 5: </w:t>
-      </w:r>
-      <w:r>
-        <w:t xml:space="preserve">the rules &amp; safety decision engine (match the patient, apply the safety rules, output a decision with a reason code for every case).</w:t>
+        <w:t xml:space="preserve">Next up — Phase 7: </w:t>
+      </w:r>
+      <w:r>
+        <w:t xml:space="preserve">the REFramework design spec — turn the services into a buildable UiPath robot design (the queue, the config, the per-item state machine, and business vs system error handling).</w:t>
       </w:r>
     </w:p>
     <w:p>
@@ -1691,10 +1769,30 @@
           <w:b/>
           <w:bCs/>
         </w:rPr>
+        <w:t xml:space="preserve">Wire it into OpenMRS (Phase 6). </w:t>
+      </w:r>
+      <w:r>
+        <w:t xml:space="preserve">Create the referral record type, write a clean referral as an encounter + observations over the REST API, then re-read it to verify. Make it idempotent (no duplicate on a rerun) and detect duplicate referrals.</w:t>
+      </w:r>
+    </w:p>
+    <w:p>
+      <w:pPr>
+        <w:pStyle w:val="ListParagraph"/>
+        <w:numPr>
+          <w:ilvl w:val="0"/>
+          <w:numId w:val="3"/>
+        </w:numPr>
+        <w:spacing w:after="80"/>
+      </w:pPr>
+      <w:r>
+        <w:rPr>
+          <w:b/>
+          <w:bCs/>
+        </w:rPr>
         <w:t xml:space="preserve">Finish the chain. </w:t>
       </w:r>
       <w:r>
-        <w:t xml:space="preserve">Map to OpenMRS → write the REFramework spec → build it in UiPath → add human review → reporting → clinical-safety docs → testing → packaging.</w:t>
+        <w:t xml:space="preserve">Write the REFramework spec → build it in UiPath → add human review → reporting → clinical-safety docs → testing → packaging.</w:t>
       </w:r>
     </w:p>
     <w:tbl>
@@ -2019,7 +2117,7 @@
         <w:t xml:space="preserve">A.  </w:t>
       </w:r>
       <w:r>
-        <w:t xml:space="preserve">Every test case has an answer key. An automated harness compares the robot's output to the expected outcome. Phase 4 result: 15 out of 15 pass.</w:t>
+        <w:t xml:space="preserve">Every test case has an answer key. An automated harness compares the robot's output to the expected outcome. Phases 4 and 5 each pass 15 out of 15; Phase 6 writes real records into OpenMRS and re-reads them to verify, 11 out of 11.</w:t>
       </w:r>
     </w:p>
     <w:p>

</xml_diff>

<commit_message>
Update plain-English guide through Phase 8
Add P7 (REFramework design spec) and P8 (live UiPath build, 15/15 run)
to the progress table; point "next up" at Phase 9.
</commit_message>
<xml_diff>
--- a/docs/Project-Explained-Simply.docx
+++ b/docs/Project-Explained-Simply.docx
@@ -1597,6 +1597,82 @@
           </w:p>
         </w:tc>
       </w:tr>
+      <w:tr>
+        <w:tc>
+          <w:tcPr>
+            <w:tcW w:type="dxa" w:w="2600"/>
+            <w:tcMar>
+              <w:top w:type="dxa" w:w="70"/>
+              <w:left w:type="dxa" w:w="120"/>
+              <w:bottom w:type="dxa" w:w="70"/>
+              <w:right w:type="dxa" w:w="120"/>
+            </w:tcMar>
+          </w:tcPr>
+          <w:p>
+            <w:r>
+              <w:rPr>
+                <w:b/>
+                <w:bCs/>
+              </w:rPr>
+              <w:t>P7 · REFramework design spec</w:t>
+            </w:r>
+          </w:p>
+        </w:tc>
+        <w:tc>
+          <w:tcPr>
+            <w:tcW w:type="dxa" w:w="6760"/>
+            <w:tcMar>
+              <w:top w:type="dxa" w:w="70"/>
+              <w:left w:type="dxa" w:w="120"/>
+              <w:bottom w:type="dxa" w:w="70"/>
+              <w:right w:type="dxa" w:w="120"/>
+            </w:tcMar>
+          </w:tcPr>
+          <w:p>
+            <w:r>
+              <w:t>Wrote the buildable UiPath blueprint — queue, Config workbook, assets, and the Business-vs-System exception rules. Result: 12/12 design review.</w:t>
+            </w:r>
+          </w:p>
+        </w:tc>
+      </w:tr>
+      <w:tr>
+        <w:tc>
+          <w:tcPr>
+            <w:tcW w:type="dxa" w:w="2600"/>
+            <w:tcMar>
+              <w:top w:type="dxa" w:w="70"/>
+              <w:left w:type="dxa" w:w="120"/>
+              <w:bottom w:type="dxa" w:w="70"/>
+              <w:right w:type="dxa" w:w="120"/>
+            </w:tcMar>
+          </w:tcPr>
+          <w:p>
+            <w:r>
+              <w:rPr>
+                <w:b/>
+                <w:bCs/>
+              </w:rPr>
+              <w:t>P8 · UiPath build (live)</w:t>
+            </w:r>
+          </w:p>
+        </w:tc>
+        <w:tc>
+          <w:tcPr>
+            <w:tcW w:type="dxa" w:w="6760"/>
+            <w:tcMar>
+              <w:top w:type="dxa" w:w="70"/>
+              <w:left w:type="dxa" w:w="120"/>
+              <w:bottom w:type="dxa" w:w="70"/>
+              <w:right w:type="dxa" w:w="120"/>
+            </w:tcMar>
+          </w:tcPr>
+          <w:p>
+            <w:r>
+              <w:t>Built the Dispatcher + REFramework robot and ran it against a REAL Orchestrator queue. Result: 15/15 — 3 created in OpenMRS, 10 sent to human review (incl. the duplicate), 1 business + 1 system exception.</w:t>
+            </w:r>
+          </w:p>
+        </w:tc>
+      </w:tr>
     </w:tbl>
     <w:p>
       <w:pPr>
@@ -1607,11 +1683,9 @@
           <w:b/>
           <w:bCs/>
         </w:rPr>
-        <w:t xml:space="preserve">Next up — Phase 7: </w:t>
-      </w:r>
-      <w:r>
-        <w:t xml:space="preserve">the REFramework design spec — turn the services into a buildable UiPath robot design (the queue, the config, the per-item state machine, and business vs system error handling).</w:t>
-      </w:r>
+        <w:t>Next up — Phase 9: human-in-the-loop review. A real store where a reviewer's decision changes the final outcome — the robot re-reads the decision and writes it to the audit trail. (Phases 0–8 are done: the robot is built and has run end-to-end, 15/15.)</w:t>
+      </w:r>
+      <w:r/>
     </w:p>
     <w:p>
       <w:r>

</xml_diff>

<commit_message>
Expand plain-English guide: three services + live-run talking points
- Tech-stack table: add the Decision and OpenMRS writeback microservices
  (framing the three services the robot orchestrates).
- Cheat sheet: add a "did you actually run it?" Q&A and a "run live, 15/15"
  power phrase; fold the live Orchestrator run into the STAR Result.
</commit_message>
<xml_diff>
--- a/docs/Project-Explained-Simply.docx
+++ b/docs/Project-Explained-Simply.docx
@@ -961,6 +961,86 @@
         <w:tc>
           <w:tcPr>
             <w:tcW w:type="dxa" w:w="2600"/>
+            <w:shd w:fill="F3F0FA" w:color="auto" w:val="clear"/>
+            <w:tcMar>
+              <w:top w:type="dxa" w:w="70"/>
+              <w:left w:type="dxa" w:w="120"/>
+              <w:bottom w:type="dxa" w:w="70"/>
+              <w:right w:type="dxa" w:w="120"/>
+            </w:tcMar>
+          </w:tcPr>
+          <w:p>
+            <w:r>
+              <w:rPr>
+                <w:b/>
+                <w:bCs/>
+              </w:rPr>
+              <w:t>Decision service (Python)</w:t>
+            </w:r>
+          </w:p>
+        </w:tc>
+        <w:tc>
+          <w:tcPr>
+            <w:tcW w:type="dxa" w:w="6760"/>
+            <w:shd w:fill="F3F0FA" w:color="auto" w:val="clear"/>
+            <w:tcMar>
+              <w:top w:type="dxa" w:w="70"/>
+              <w:left w:type="dxa" w:w="120"/>
+              <w:bottom w:type="dxa" w:w="70"/>
+              <w:right w:type="dxa" w:w="120"/>
+            </w:tcMar>
+          </w:tcPr>
+          <w:p>
+            <w:r>
+              <w:t>The rules engine as a service. The robot calls it over HTTP; it matches the patient and applies the safety rules, returning one routing decision with reason codes. The AI never reaches this layer.</w:t>
+            </w:r>
+          </w:p>
+        </w:tc>
+      </w:tr>
+      <w:tr>
+        <w:tc>
+          <w:tcPr>
+            <w:tcW w:type="dxa" w:w="2600"/>
+            <w:shd w:fill="F3F0FA" w:color="auto" w:val="clear"/>
+            <w:tcMar>
+              <w:top w:type="dxa" w:w="70"/>
+              <w:left w:type="dxa" w:w="120"/>
+              <w:bottom w:type="dxa" w:w="70"/>
+              <w:right w:type="dxa" w:w="120"/>
+            </w:tcMar>
+          </w:tcPr>
+          <w:p>
+            <w:r>
+              <w:rPr>
+                <w:b/>
+                <w:bCs/>
+              </w:rPr>
+              <w:t>OpenMRS writeback service (Python)</w:t>
+            </w:r>
+          </w:p>
+        </w:tc>
+        <w:tc>
+          <w:tcPr>
+            <w:tcW w:type="dxa" w:w="6760"/>
+            <w:shd w:fill="F3F0FA" w:color="auto" w:val="clear"/>
+            <w:tcMar>
+              <w:top w:type="dxa" w:w="70"/>
+              <w:left w:type="dxa" w:w="120"/>
+              <w:bottom w:type="dxa" w:w="70"/>
+              <w:right w:type="dxa" w:w="120"/>
+            </w:tcMar>
+          </w:tcPr>
+          <w:p>
+            <w:r>
+              <w:t>Wraps the tested record-writer behind HTTP. For a clean referral the robot calls it to create the record in OpenMRS and verify it by re-reading. The third of the three microservices the robot orchestrates (extraction · decision · writeback).</w:t>
+            </w:r>
+          </w:p>
+        </w:tc>
+      </w:tr>
+      <w:tr>
+        <w:tc>
+          <w:tcPr>
+            <w:tcW w:type="dxa" w:w="2600"/>
             <w:tcMar>
               <w:top w:type="dxa" w:w="70"/>
               <w:left w:type="dxa" w:w="120"/>
@@ -2036,11 +2116,9 @@
                 <w:b/>
                 <w:bCs/>
               </w:rPr>
-              <w:t xml:space="preserve">Result: </w:t>
-            </w:r>
-            <w:r>
-              <w:t xml:space="preserve">A defensible, auditable pipeline where AI only assists and rules/humans own every decision. Each scenario passes an automated acceptance test; built to DCB0129/DCB0160-inspired standards.</w:t>
-            </w:r>
+              <w:t>Result: A defensible, auditable pipeline where AI only assists and rules/humans own every decision. Each scenario passes an automated acceptance test; built to DCB0129/DCB0160-inspired standards. The robot was then built and run LIVE against a real Orchestrator queue: all 15 referrals processed correctly (15/15) — 3 created in OpenMRS, 10 to human review (incl. a duplicate), 1 business and 1 system exception.</w:t>
+            </w:r>
+            <w:r/>
           </w:p>
         </w:tc>
       </w:tr>
@@ -2192,6 +2270,34 @@
       </w:r>
       <w:r>
         <w:t xml:space="preserve">Every test case has an answer key. An automated harness compares the robot's output to the expected outcome. Phases 4 and 5 each pass 15 out of 15; Phase 6 writes real records into OpenMRS and re-reads them to verify, 11 out of 11.</w:t>
+      </w:r>
+    </w:p>
+    <w:p>
+      <w:pPr>
+        <w:spacing w:after="30" w:before="100"/>
+      </w:pPr>
+      <w:r>
+        <w:rPr>
+          <w:b/>
+          <w:bCs/>
+          <w:color w:val="0D3F7A"/>
+        </w:rPr>
+        <w:t xml:space="preserve">Q.  Did you actually run it, or just design it?</w:t>
+      </w:r>
+    </w:p>
+    <w:p>
+      <w:pPr>
+        <w:spacing w:after="80"/>
+      </w:pPr>
+      <w:r>
+        <w:rPr>
+          <w:b/>
+          <w:bCs/>
+        </w:rPr>
+        <w:t xml:space="preserve">A.  I ran it live. A Dispatcher fills a real Orchestrator queue; the REFramework robot drains it and processes all 15 referrals — 3 created in OpenMRS (and verified by re-reading them), 10 routed to human review including a duplicate, plus one business and one system exception. 15/15, matching the answer keys.</w:t>
+      </w:r>
+      <w:r>
+        <w:t xml:space="preserve"/>
       </w:r>
     </w:p>
     <w:p>
@@ -2286,6 +2392,23 @@
           <w:iCs/>
         </w:rPr>
         <w:t xml:space="preserve">“Every decision carries a reason code and an audit trail.”</w:t>
+      </w:r>
+    </w:p>
+    <w:p>
+      <w:pPr>
+        <w:pStyle w:val="ListParagraph"/>
+        <w:numPr>
+          <w:ilvl w:val="0"/>
+          <w:numId w:val="2"/>
+        </w:numPr>
+        <w:spacing w:after="60"/>
+      </w:pPr>
+      <w:r>
+        <w:rPr>
+          <w:i/>
+          <w:iCs/>
+        </w:rPr>
+        <w:t xml:space="preserve">“Built and run live against a real Orchestrator queue — 15/15, not slideware.”</w:t>
       </w:r>
     </w:p>
     <w:p>

</xml_diff>

<commit_message>
Add "Open and run the finished robot" steps to the plain-English guide
New section 8 with 5 sub-steps (start services + OpenMRS + login/queue,
open in Studio, run Dispatcher then Performer, see the evidence, reset for
a clean re-run); interview cheat sheet renumbered to section 9.
</commit_message>
<xml_diff>
--- a/docs/Project-Explained-Simply.docx
+++ b/docs/Project-Explained-Simply.docx
@@ -2023,7 +2023,165 @@
         <w:spacing w:after="140" w:before="280"/>
       </w:pPr>
       <w:r>
-        <w:t xml:space="preserve">8.  Interview cheat sheet</w:t>
+        <w:t xml:space="preserve">8.  Open and run the finished robot</w:t>
+      </w:r>
+    </w:p>
+    <w:p>
+      <w:pPr>
+        <w:spacing w:after="120"/>
+      </w:pPr>
+      <w:r>
+        <w:t xml:space="preserve">Phases 0–8 are built, so you can run the whole thing yourself. Two ways: in UiPath Studio (click Run) or from the command line. Either way, the moving parts below must be up first. All data is synthetic.</w:t>
+      </w:r>
+    </w:p>
+    <w:p>
+      <w:pPr>
+        <w:pStyle w:val="Heading2"/>
+        <w:spacing w:after="100" w:before="200"/>
+      </w:pPr>
+      <w:r>
+        <w:t xml:space="preserve">Step 1 — Start the moving parts</w:t>
+      </w:r>
+    </w:p>
+    <w:p>
+      <w:pPr>
+        <w:spacing w:after="120"/>
+      </w:pPr>
+      <w:r>
+        <w:t xml:space="preserve">1) OpenMRS (the hospital records system): start Docker Desktop, then bring it up — docker compose -f openmrs-setup/docker-compose.yml up -d — and wait until it answers (browser http://localhost/openmrs/spa, login admin / Admin123).</w:t>
+      </w:r>
+    </w:p>
+    <w:p>
+      <w:pPr>
+        <w:spacing w:after="120"/>
+      </w:pPr>
+      <w:r>
+        <w:t xml:space="preserve">2) The three helper services, each in its own terminal: in services/extraction-service run python app.py (port 8089); in services/rules-engine run python app.py (port 8090); in services/openmrs-workflow run python app.py (port 8091).</w:t>
+      </w:r>
+    </w:p>
+    <w:p>
+      <w:pPr>
+        <w:spacing w:after="120"/>
+      </w:pPr>
+      <w:r>
+        <w:t xml:space="preserve">3) Sign in to UiPath Cloud once: uip login. One-time machine setup: install the .NET 8 SDK so the UiPath CLI can build and run — the exact steps are in the build log.</w:t>
+      </w:r>
+    </w:p>
+    <w:p>
+      <w:pPr>
+        <w:spacing w:after="120"/>
+      </w:pPr>
+      <w:r>
+        <w:t xml:space="preserve">4) Make sure the queue exists: a queue named NHS_Referrals in the Shared folder, with 'enforce unique reference' switched on (create it once in Orchestrator, or with uip or queues create).</w:t>
+      </w:r>
+    </w:p>
+    <w:p>
+      <w:pPr>
+        <w:pStyle w:val="Heading2"/>
+        <w:spacing w:after="100" w:before="200"/>
+      </w:pPr>
+      <w:r>
+        <w:t xml:space="preserve">Step 2 — Open it in Studio (optional, to look around)</w:t>
+      </w:r>
+    </w:p>
+    <w:p>
+      <w:pPr>
+        <w:spacing w:after="120"/>
+      </w:pPr>
+      <w:r>
+        <w:t xml:space="preserve">Open UiPath Studio → Open a local project → choose uipath/NHS.ReferralSafety.Performer/project.json. You'll see the REFramework state machine; open Framework/Process.xaml to see the routing (the Switch on the decision). The dispatcher is the sister project, uipath/NHS.ReferralSafety.Dispatcher.</w:t>
+      </w:r>
+    </w:p>
+    <w:p>
+      <w:pPr>
+        <w:pStyle w:val="Heading2"/>
+        <w:spacing w:after="100" w:before="200"/>
+      </w:pPr>
+      <w:r>
+        <w:t xml:space="preserve">Step 3 — Run it</w:t>
+      </w:r>
+    </w:p>
+    <w:p>
+      <w:pPr>
+        <w:spacing w:after="120"/>
+      </w:pPr>
+      <w:r>
+        <w:t xml:space="preserve">First put the 15 referrals on the queue (the Dispatcher), then process them (the Performer).</w:t>
+      </w:r>
+    </w:p>
+    <w:p>
+      <w:pPr>
+        <w:spacing w:after="120"/>
+      </w:pPr>
+      <w:r>
+        <w:t xml:space="preserve">In Studio: open the Dispatcher and press Run (fills the queue with 15 items), then open the Performer and press Run (works through all 15, one at a time).</w:t>
+      </w:r>
+    </w:p>
+    <w:p>
+      <w:pPr>
+        <w:spacing w:after="120"/>
+      </w:pPr>
+      <w:r>
+        <w:t xml:space="preserve">From the command line: set the .NET path once with export PATH="/c/Program Files/dotnet:$PATH", then run uip rpa run --file-path Main.xaml inside the Dispatcher folder, then the same inside the Performer folder.</w:t>
+      </w:r>
+    </w:p>
+    <w:p>
+      <w:pPr>
+        <w:pStyle w:val="Heading2"/>
+        <w:spacing w:after="100" w:before="200"/>
+      </w:pPr>
+      <w:r>
+        <w:t xml:space="preserve">Step 4 — See the evidence</w:t>
+      </w:r>
+    </w:p>
+    <w:p>
+      <w:pPr>
+        <w:spacing w:after="120"/>
+      </w:pPr>
+      <w:r>
+        <w:t xml:space="preserve">Orchestrator → Queues → NHS_Referrals: 13 Successful + 2 Failed.</w:t>
+      </w:r>
+    </w:p>
+    <w:p>
+      <w:pPr>
+        <w:spacing w:after="120"/>
+      </w:pPr>
+      <w:r>
+        <w:t xml:space="preserve">OpenMRS: open Oliver Bennett's chart — there's a new Referral encounter the robot created and then re-read to verify.</w:t>
+      </w:r>
+    </w:p>
+    <w:p>
+      <w:pPr>
+        <w:spacing w:after="120"/>
+      </w:pPr>
+      <w:r>
+        <w:t xml:space="preserve">On disk: data/audit/audit-log.csv (15 rows, one per referral), data/review/review-store.csv (the 10 cases waiting for a human), and the processed / review / failed folders the letters were sorted into.</w:t>
+      </w:r>
+    </w:p>
+    <w:p>
+      <w:pPr>
+        <w:pStyle w:val="Heading2"/>
+        <w:spacing w:after="100" w:before="200"/>
+      </w:pPr>
+      <w:r>
+        <w:t xml:space="preserve">Step 5 — Reset for a clean re-run</w:t>
+      </w:r>
+    </w:p>
+    <w:p>
+      <w:pPr>
+        <w:spacing w:after="120"/>
+      </w:pPr>
+      <w:r>
+        <w:t xml:space="preserve">A run files the letters away and writes records, so before running again: restore the letters (git checkout -- data/input-referrals), clear the processed/review/failed folders and the two CSVs, reset OpenMRS to baseline (python services/openmrs-workflow/reset_openmrs_baseline.py), and recreate the NHS_Referrals queue. Then repeat Step 3.</w:t>
+      </w:r>
+    </w:p>
+    <w:p>
+      <w:pPr>
+        <w:pStyle w:val="Heading1"/>
+        <w:spacing w:after="140" w:before="280"/>
+      </w:pPr>
+      <w:r>
+        <w:t xml:space="preserve">9.  Interview cheat sheet</w:t>
       </w:r>
     </w:p>
     <w:p>

</xml_diff>